<commit_message>
Update committee resumes with verified award certificates + 김장하 scholarship
- 표창장 원본 판독: 국무총리(214912,2021)·농식품부장관(99209,2016)·경기도지사 김동연(7827,2025)·경기도의회의장(25-11993,2025)
- 추가: 2021 친환경축산대상 최우수(송영신목장)·연변대 국제심포지엄 초청발표(2025.7.4)
- 학력: 진주 명신고 김장하(남성학숙) 장학생
- founder-context 영구 기억 갱신; 이재명 도지사상/한자 정본은 확인 대기

https://claude.ai/code/session_01Y6TtAZhVDLaxNYjVmtcmpZ
</commit_message>
<xml_diff>
--- a/deliverables/하현제_이력서_축산인수전문위원_추천용.docx
+++ b/deliverables/하현제_이력서_축산인수전문위원_추천용.docx
@@ -60,7 +60,7 @@
           <w:color w:val="555555"/>
           <w:sz w:val="18"/>
         </w:rPr>
-        <w:t>생년월일 1973.10.25  |  수의사 면허 제10193호  |  휴대전화 010-6205-3150  |  hhj3150@hanmail.net</w:t>
+        <w:t>생년월일 1973.10.25 | 수의사 면허 제10193호 | 010-6205-3150 | hhj3150@hanmail.net | 경기 안성시 미양면 역전길 14-42</w:t>
       </w:r>
     </w:p>
     <w:p>
@@ -77,7 +77,7 @@
           <w:color w:val="555555"/>
           <w:sz w:val="18"/>
         </w:rPr>
-        <w:t>소속 ㈜제네틱스 대표이사 · 송영신목장 대표 · ㈜디투오(D2O) 대표 · 경기도 안성</w:t>
+        <w:t>소속 ㈜제네틱스 대표이사 · 송영신목장 대표 · ㈜디투오(D2O) 대표</w:t>
       </w:r>
     </w:p>
     <w:p>
@@ -107,7 +107,7 @@
           <w:b w:val="0"/>
           <w:sz w:val="21"/>
         </w:rPr>
-        <w:t>경기도는 전국 젖소 사육두수의 40% 이상을 보유한 대한민국 최대 낙농 기반입니다. 본 후보자는 경기 안성에서 동물복지·저탄소·경축순환 목장을 직접 운영하는 수의사이자, 국무총리 표창·농림축산식품부 장관상·경기도지사상·경기도의회 의장 표창 수상, 국내 1호 동물복지·저탄소 인증, 대한민국 최초 젖소 성감별 수정란 수출 등 현장에서 검증된 성과를 보유한 축산 전 분야 통합 전문가입니다. 가축질병·번식, 축산환경·악취, 탄소중립, ICT·AI 정밀축산, 6차산업까지 정책 설계에 필요한 현장성과 전문성을 두루 갖추어, 경기도지사직 인수위원회 축산·동물방역 분야 인수전문위원으로 적임입니다.</w:t>
+        <w:t>경기도는 전국 젖소 사육두수의 40% 이상을 보유한 대한민국 최대 낙농 기반입니다. 본 후보자는 경기 안성에서 동물복지·저탄소·경축순환 목장을 직접 운영하는 수의사로, 국무총리 표창·농림축산식품부 장관 표창·경기도지사 표창·경기도의회 의장 표창을 수상하고, 국내 1호 동물복지·저탄소 인증, 대한민국 최초 젖소 성감별 수정란 수출 등 현장에서 검증된 성과를 보유한 축산 전 분야 통합 전문가입니다. 가축질병·번식, 축산환경·악취, 탄소중립, ICT·AI 정밀축산, 6차산업까지 정책 설계에 필요한 현장성과 전문성을 두루 갖추어 인수전문위원으로 적임입니다.</w:t>
       </w:r>
     </w:p>
     <w:p>
@@ -135,13 +135,15 @@
         <w:tblLook w:firstColumn="1" w:firstRow="1" w:lastColumn="0" w:lastRow="0" w:noHBand="0" w:noVBand="1" w:val="04A0"/>
       </w:tblPr>
       <w:tblGrid>
-        <w:gridCol w:w="4986"/>
-        <w:gridCol w:w="4986"/>
+        <w:gridCol w:w="2521"/>
+        <w:gridCol w:w="2521"/>
+        <w:gridCol w:w="2521"/>
+        <w:gridCol w:w="2521"/>
       </w:tblGrid>
       <w:tr>
         <w:tc>
           <w:tcPr>
-            <w:tcW w:type="dxa" w:w="5953"/>
+            <w:tcW w:type="dxa" w:w="3402"/>
             <w:vAlign w:val="center"/>
             <w:shd w:val="clear" w:fill="DCE6DC"/>
           </w:tcPr>
@@ -163,7 +165,7 @@
         </w:tc>
         <w:tc>
           <w:tcPr>
-            <w:tcW w:type="dxa" w:w="3118"/>
+            <w:tcW w:type="dxa" w:w="1701"/>
             <w:vAlign w:val="center"/>
             <w:shd w:val="clear" w:fill="DCE6DC"/>
           </w:tcPr>
@@ -179,7 +181,51 @@
                 <w:b/>
                 <w:sz w:val="19"/>
               </w:rPr>
-              <w:t>수여 기관</w:t>
+              <w:t>문서번호</w:t>
+            </w:r>
+          </w:p>
+        </w:tc>
+        <w:tc>
+          <w:tcPr>
+            <w:tcW w:type="dxa" w:w="1474"/>
+            <w:vAlign w:val="center"/>
+            <w:shd w:val="clear" w:fill="DCE6DC"/>
+          </w:tcPr>
+          <w:p>
+            <w:pPr>
+              <w:spacing w:after="20" w:before="20"/>
+              <w:jc w:val="center"/>
+            </w:pPr>
+            <w:r/>
+            <w:r>
+              <w:rPr>
+                <w:rFonts w:ascii="Malgun Gothic" w:hAnsi="Malgun Gothic" w:eastAsia="Malgun Gothic"/>
+                <w:b/>
+                <w:sz w:val="19"/>
+              </w:rPr>
+              <w:t>일자</w:t>
+            </w:r>
+          </w:p>
+        </w:tc>
+        <w:tc>
+          <w:tcPr>
+            <w:tcW w:type="dxa" w:w="2608"/>
+            <w:vAlign w:val="center"/>
+            <w:shd w:val="clear" w:fill="DCE6DC"/>
+          </w:tcPr>
+          <w:p>
+            <w:pPr>
+              <w:spacing w:after="20" w:before="20"/>
+              <w:jc w:val="center"/>
+            </w:pPr>
+            <w:r/>
+            <w:r>
+              <w:rPr>
+                <w:rFonts w:ascii="Malgun Gothic" w:hAnsi="Malgun Gothic" w:eastAsia="Malgun Gothic"/>
+                <w:b/>
+                <w:sz w:val="19"/>
+              </w:rPr>
+              <w:t>수여 기관(서명)</w:t>
             </w:r>
           </w:p>
         </w:tc>
@@ -187,7 +233,7 @@
       <w:tr>
         <w:tc>
           <w:tcPr>
-            <w:tcW w:type="dxa" w:w="5953"/>
+            <w:tcW w:type="dxa" w:w="3402"/>
             <w:vAlign w:val="center"/>
           </w:tcPr>
           <w:p>
@@ -200,7 +246,7 @@
               <w:rPr>
                 <w:rFonts w:ascii="Malgun Gothic" w:hAnsi="Malgun Gothic" w:eastAsia="Malgun Gothic"/>
                 <w:b/>
-                <w:sz w:val="19"/>
+                <w:sz w:val="18"/>
               </w:rPr>
               <w:t>국무총리 표창</w:t>
             </w:r>
@@ -208,7 +254,7 @@
         </w:tc>
         <w:tc>
           <w:tcPr>
-            <w:tcW w:type="dxa" w:w="3118"/>
+            <w:tcW w:type="dxa" w:w="1701"/>
             <w:vAlign w:val="center"/>
           </w:tcPr>
           <w:p>
@@ -221,9 +267,51 @@
               <w:rPr>
                 <w:rFonts w:ascii="Malgun Gothic" w:hAnsi="Malgun Gothic" w:eastAsia="Malgun Gothic"/>
                 <w:b w:val="0"/>
-                <w:sz w:val="19"/>
+                <w:sz w:val="18"/>
               </w:rPr>
-              <w:t>국무총리실</w:t>
+              <w:t>제214912호</w:t>
+            </w:r>
+          </w:p>
+        </w:tc>
+        <w:tc>
+          <w:tcPr>
+            <w:tcW w:type="dxa" w:w="1474"/>
+            <w:vAlign w:val="center"/>
+          </w:tcPr>
+          <w:p>
+            <w:pPr>
+              <w:spacing w:after="20" w:before="20"/>
+              <w:jc w:val="center"/>
+            </w:pPr>
+            <w:r/>
+            <w:r>
+              <w:rPr>
+                <w:rFonts w:ascii="Malgun Gothic" w:hAnsi="Malgun Gothic" w:eastAsia="Malgun Gothic"/>
+                <w:b w:val="0"/>
+                <w:sz w:val="18"/>
+              </w:rPr>
+              <w:t>2021.12.11</w:t>
+            </w:r>
+          </w:p>
+        </w:tc>
+        <w:tc>
+          <w:tcPr>
+            <w:tcW w:type="dxa" w:w="2608"/>
+            <w:vAlign w:val="center"/>
+          </w:tcPr>
+          <w:p>
+            <w:pPr>
+              <w:spacing w:after="20" w:before="20"/>
+              <w:jc w:val="center"/>
+            </w:pPr>
+            <w:r/>
+            <w:r>
+              <w:rPr>
+                <w:rFonts w:ascii="Malgun Gothic" w:hAnsi="Malgun Gothic" w:eastAsia="Malgun Gothic"/>
+                <w:b w:val="0"/>
+                <w:sz w:val="18"/>
+              </w:rPr>
+              <w:t>국무총리 김부겸</w:t>
             </w:r>
           </w:p>
         </w:tc>
@@ -231,7 +319,7 @@
       <w:tr>
         <w:tc>
           <w:tcPr>
-            <w:tcW w:type="dxa" w:w="5953"/>
+            <w:tcW w:type="dxa" w:w="3402"/>
             <w:vAlign w:val="center"/>
           </w:tcPr>
           <w:p>
@@ -244,15 +332,15 @@
               <w:rPr>
                 <w:rFonts w:ascii="Malgun Gothic" w:hAnsi="Malgun Gothic" w:eastAsia="Malgun Gothic"/>
                 <w:b/>
-                <w:sz w:val="19"/>
+                <w:sz w:val="18"/>
               </w:rPr>
-              <w:t>농림축산식품부 장관상 (2016)</w:t>
+              <w:t>농림축산식품부 장관 표창</w:t>
             </w:r>
           </w:p>
         </w:tc>
         <w:tc>
           <w:tcPr>
-            <w:tcW w:type="dxa" w:w="3118"/>
+            <w:tcW w:type="dxa" w:w="1701"/>
             <w:vAlign w:val="center"/>
           </w:tcPr>
           <w:p>
@@ -265,9 +353,51 @@
               <w:rPr>
                 <w:rFonts w:ascii="Malgun Gothic" w:hAnsi="Malgun Gothic" w:eastAsia="Malgun Gothic"/>
                 <w:b w:val="0"/>
-                <w:sz w:val="19"/>
+                <w:sz w:val="18"/>
               </w:rPr>
-              <w:t>농림축산식품부</w:t>
+              <w:t>제99209호</w:t>
+            </w:r>
+          </w:p>
+        </w:tc>
+        <w:tc>
+          <w:tcPr>
+            <w:tcW w:type="dxa" w:w="1474"/>
+            <w:vAlign w:val="center"/>
+          </w:tcPr>
+          <w:p>
+            <w:pPr>
+              <w:spacing w:after="20" w:before="20"/>
+              <w:jc w:val="center"/>
+            </w:pPr>
+            <w:r/>
+            <w:r>
+              <w:rPr>
+                <w:rFonts w:ascii="Malgun Gothic" w:hAnsi="Malgun Gothic" w:eastAsia="Malgun Gothic"/>
+                <w:b w:val="0"/>
+                <w:sz w:val="18"/>
+              </w:rPr>
+              <w:t>2016.12.30</w:t>
+            </w:r>
+          </w:p>
+        </w:tc>
+        <w:tc>
+          <w:tcPr>
+            <w:tcW w:type="dxa" w:w="2608"/>
+            <w:vAlign w:val="center"/>
+          </w:tcPr>
+          <w:p>
+            <w:pPr>
+              <w:spacing w:after="20" w:before="20"/>
+              <w:jc w:val="center"/>
+            </w:pPr>
+            <w:r/>
+            <w:r>
+              <w:rPr>
+                <w:rFonts w:ascii="Malgun Gothic" w:hAnsi="Malgun Gothic" w:eastAsia="Malgun Gothic"/>
+                <w:b w:val="0"/>
+                <w:sz w:val="18"/>
+              </w:rPr>
+              <w:t>장관 김재수</w:t>
             </w:r>
           </w:p>
         </w:tc>
@@ -275,7 +405,7 @@
       <w:tr>
         <w:tc>
           <w:tcPr>
-            <w:tcW w:type="dxa" w:w="5953"/>
+            <w:tcW w:type="dxa" w:w="3402"/>
             <w:vAlign w:val="center"/>
           </w:tcPr>
           <w:p>
@@ -288,15 +418,15 @@
               <w:rPr>
                 <w:rFonts w:ascii="Malgun Gothic" w:hAnsi="Malgun Gothic" w:eastAsia="Malgun Gothic"/>
                 <w:b/>
-                <w:sz w:val="19"/>
+                <w:sz w:val="18"/>
               </w:rPr>
-              <w:t>경기도지사상 (이재명 지사 재임 시 수여)</w:t>
+              <w:t>경기도지사 표창</w:t>
             </w:r>
           </w:p>
         </w:tc>
         <w:tc>
           <w:tcPr>
-            <w:tcW w:type="dxa" w:w="3118"/>
+            <w:tcW w:type="dxa" w:w="1701"/>
             <w:vAlign w:val="center"/>
           </w:tcPr>
           <w:p>
@@ -309,9 +439,51 @@
               <w:rPr>
                 <w:rFonts w:ascii="Malgun Gothic" w:hAnsi="Malgun Gothic" w:eastAsia="Malgun Gothic"/>
                 <w:b w:val="0"/>
-                <w:sz w:val="19"/>
+                <w:sz w:val="18"/>
               </w:rPr>
-              <w:t>경기도</w:t>
+              <w:t>제7827호</w:t>
+            </w:r>
+          </w:p>
+        </w:tc>
+        <w:tc>
+          <w:tcPr>
+            <w:tcW w:type="dxa" w:w="1474"/>
+            <w:vAlign w:val="center"/>
+          </w:tcPr>
+          <w:p>
+            <w:pPr>
+              <w:spacing w:after="20" w:before="20"/>
+              <w:jc w:val="center"/>
+            </w:pPr>
+            <w:r/>
+            <w:r>
+              <w:rPr>
+                <w:rFonts w:ascii="Malgun Gothic" w:hAnsi="Malgun Gothic" w:eastAsia="Malgun Gothic"/>
+                <w:b w:val="0"/>
+                <w:sz w:val="18"/>
+              </w:rPr>
+              <w:t>2025.12.31</w:t>
+            </w:r>
+          </w:p>
+        </w:tc>
+        <w:tc>
+          <w:tcPr>
+            <w:tcW w:type="dxa" w:w="2608"/>
+            <w:vAlign w:val="center"/>
+          </w:tcPr>
+          <w:p>
+            <w:pPr>
+              <w:spacing w:after="20" w:before="20"/>
+              <w:jc w:val="center"/>
+            </w:pPr>
+            <w:r/>
+            <w:r>
+              <w:rPr>
+                <w:rFonts w:ascii="Malgun Gothic" w:hAnsi="Malgun Gothic" w:eastAsia="Malgun Gothic"/>
+                <w:b w:val="0"/>
+                <w:sz w:val="18"/>
+              </w:rPr>
+              <w:t>경기도지사 김동연</w:t>
             </w:r>
           </w:p>
         </w:tc>
@@ -319,7 +491,7 @@
       <w:tr>
         <w:tc>
           <w:tcPr>
-            <w:tcW w:type="dxa" w:w="5953"/>
+            <w:tcW w:type="dxa" w:w="3402"/>
             <w:vAlign w:val="center"/>
           </w:tcPr>
           <w:p>
@@ -332,15 +504,15 @@
               <w:rPr>
                 <w:rFonts w:ascii="Malgun Gothic" w:hAnsi="Malgun Gothic" w:eastAsia="Malgun Gothic"/>
                 <w:b/>
-                <w:sz w:val="19"/>
+                <w:sz w:val="18"/>
               </w:rPr>
-              <w:t>경기도의회 의장 표창 — 친환경축산 유공 (2025.12.26)</w:t>
+              <w:t>경기도의회 의장 표창 (친환경축산 유공)</w:t>
             </w:r>
           </w:p>
         </w:tc>
         <w:tc>
           <w:tcPr>
-            <w:tcW w:type="dxa" w:w="3118"/>
+            <w:tcW w:type="dxa" w:w="1701"/>
             <w:vAlign w:val="center"/>
           </w:tcPr>
           <w:p>
@@ -353,14 +525,102 @@
               <w:rPr>
                 <w:rFonts w:ascii="Malgun Gothic" w:hAnsi="Malgun Gothic" w:eastAsia="Malgun Gothic"/>
                 <w:b w:val="0"/>
-                <w:sz w:val="19"/>
+                <w:sz w:val="18"/>
               </w:rPr>
-              <w:t>경기도의회</w:t>
+              <w:t>제25-11993호</w:t>
+            </w:r>
+          </w:p>
+        </w:tc>
+        <w:tc>
+          <w:tcPr>
+            <w:tcW w:type="dxa" w:w="1474"/>
+            <w:vAlign w:val="center"/>
+          </w:tcPr>
+          <w:p>
+            <w:pPr>
+              <w:spacing w:after="20" w:before="20"/>
+              <w:jc w:val="center"/>
+            </w:pPr>
+            <w:r/>
+            <w:r>
+              <w:rPr>
+                <w:rFonts w:ascii="Malgun Gothic" w:hAnsi="Malgun Gothic" w:eastAsia="Malgun Gothic"/>
+                <w:b w:val="0"/>
+                <w:sz w:val="18"/>
+              </w:rPr>
+              <w:t>2025.12.26</w:t>
+            </w:r>
+          </w:p>
+        </w:tc>
+        <w:tc>
+          <w:tcPr>
+            <w:tcW w:type="dxa" w:w="2608"/>
+            <w:vAlign w:val="center"/>
+          </w:tcPr>
+          <w:p>
+            <w:pPr>
+              <w:spacing w:after="20" w:before="20"/>
+              <w:jc w:val="center"/>
+            </w:pPr>
+            <w:r/>
+            <w:r>
+              <w:rPr>
+                <w:rFonts w:ascii="Malgun Gothic" w:hAnsi="Malgun Gothic" w:eastAsia="Malgun Gothic"/>
+                <w:b w:val="0"/>
+                <w:sz w:val="18"/>
+              </w:rPr>
+              <w:t>경기도의회 의장</w:t>
             </w:r>
           </w:p>
         </w:tc>
       </w:tr>
     </w:tbl>
+    <w:p>
+      <w:pPr>
+        <w:pStyle w:val="ListBullet"/>
+        <w:spacing w:after="40"/>
+      </w:pPr>
+      <w:r>
+        <w:rPr>
+          <w:rFonts w:ascii="Malgun Gothic" w:hAnsi="Malgun Gothic" w:eastAsia="Malgun Gothic"/>
+          <w:b/>
+          <w:color w:val="1B5E3A"/>
+          <w:sz w:val="19"/>
+        </w:rPr>
+        <w:t xml:space="preserve">▸ 목장 수상  </w:t>
+      </w:r>
+      <w:r>
+        <w:rPr>
+          <w:rFonts w:ascii="Malgun Gothic" w:hAnsi="Malgun Gothic" w:eastAsia="Malgun Gothic"/>
+          <w:b w:val="0"/>
+          <w:sz w:val="19"/>
+        </w:rPr>
+        <w:t>2021 친환경축산대상 인증농가부문 최우수상 (제2021-02호, 2021.12.07, 농식품부 주최·(사)친환경축산협회) — 송영신목장</w:t>
+      </w:r>
+    </w:p>
+    <w:p>
+      <w:pPr>
+        <w:pStyle w:val="ListBullet"/>
+        <w:spacing w:after="40"/>
+      </w:pPr>
+      <w:r>
+        <w:rPr>
+          <w:rFonts w:ascii="Malgun Gothic" w:hAnsi="Malgun Gothic" w:eastAsia="Malgun Gothic"/>
+          <w:b/>
+          <w:color w:val="1B5E3A"/>
+          <w:sz w:val="19"/>
+        </w:rPr>
+        <w:t xml:space="preserve">▸ 국제 학술  </w:t>
+      </w:r>
+      <w:r>
+        <w:rPr>
+          <w:rFonts w:ascii="Malgun Gothic" w:hAnsi="Malgun Gothic" w:eastAsia="Malgun Gothic"/>
+          <w:b w:val="0"/>
+          <w:sz w:val="19"/>
+        </w:rPr>
+        <w:t>연변대학교 농학원 제3회 해란강포럼 국제심포지엄 특별초청 발표 (2025.7.4) — “지속가능 농업의 축산: 생태적 회복력의 경로와 실천”</w:t>
+      </w:r>
+    </w:p>
     <w:p>
       <w:pPr>
         <w:spacing w:before="180" w:after="60"/>
@@ -490,7 +750,7 @@
           <w:b w:val="0"/>
           <w:sz w:val="21"/>
         </w:rPr>
-        <w:t>경기도 저지(Jersey) 전용목장 2호 (송영신목장) · 경축순환·자원순환 힐링퇴비 모델</w:t>
+        <w:t>경기도 저지(Jersey) 전용목장 2호 (송영신목장) · 경축순환·힐링퇴비 모델</w:t>
       </w:r>
     </w:p>
     <w:p>
@@ -518,14 +778,14 @@
         <w:tblLook w:firstColumn="1" w:firstRow="1" w:lastColumn="0" w:lastRow="0" w:noHBand="0" w:noVBand="1" w:val="04A0"/>
       </w:tblPr>
       <w:tblGrid>
-        <w:gridCol w:w="3324"/>
-        <w:gridCol w:w="3324"/>
-        <w:gridCol w:w="3324"/>
+        <w:gridCol w:w="3362"/>
+        <w:gridCol w:w="3362"/>
+        <w:gridCol w:w="3362"/>
       </w:tblGrid>
       <w:tr>
         <w:tc>
           <w:tcPr>
-            <w:tcW w:type="dxa" w:w="2041"/>
+            <w:tcW w:type="dxa" w:w="1814"/>
             <w:vAlign w:val="center"/>
             <w:shd w:val="clear" w:fill="EAEFEA"/>
           </w:tcPr>
@@ -547,7 +807,7 @@
         </w:tc>
         <w:tc>
           <w:tcPr>
-            <w:tcW w:type="dxa" w:w="4762"/>
+            <w:tcW w:type="dxa" w:w="4195"/>
             <w:vAlign w:val="center"/>
             <w:shd w:val="clear" w:fill="EAEFEA"/>
           </w:tcPr>
@@ -569,7 +829,7 @@
         </w:tc>
         <w:tc>
           <w:tcPr>
-            <w:tcW w:type="dxa" w:w="2268"/>
+            <w:tcW w:type="dxa" w:w="3061"/>
             <w:vAlign w:val="center"/>
             <w:shd w:val="clear" w:fill="EAEFEA"/>
           </w:tcPr>
@@ -593,7 +853,7 @@
       <w:tr>
         <w:tc>
           <w:tcPr>
-            <w:tcW w:type="dxa" w:w="2041"/>
+            <w:tcW w:type="dxa" w:w="1814"/>
             <w:vAlign w:val="center"/>
           </w:tcPr>
           <w:p>
@@ -608,13 +868,13 @@
                 <w:b w:val="0"/>
                 <w:sz w:val="19"/>
               </w:rPr>
-              <w:t>~ 1991</w:t>
+              <w:t>~ 1992.02</w:t>
             </w:r>
           </w:p>
         </w:tc>
         <w:tc>
           <w:tcPr>
-            <w:tcW w:type="dxa" w:w="4762"/>
+            <w:tcW w:type="dxa" w:w="4195"/>
             <w:vAlign w:val="center"/>
           </w:tcPr>
           <w:p>
@@ -635,7 +895,7 @@
         </w:tc>
         <w:tc>
           <w:tcPr>
-            <w:tcW w:type="dxa" w:w="2268"/>
+            <w:tcW w:type="dxa" w:w="3061"/>
             <w:vAlign w:val="center"/>
           </w:tcPr>
           <w:p>
@@ -650,7 +910,7 @@
                 <w:b w:val="0"/>
                 <w:sz w:val="19"/>
               </w:rPr>
-              <w:t>졸업</w:t>
+              <w:t>졸업 / 김장하(남성학숙) 장학생</w:t>
             </w:r>
           </w:p>
         </w:tc>
@@ -658,7 +918,7 @@
       <w:tr>
         <w:tc>
           <w:tcPr>
-            <w:tcW w:type="dxa" w:w="2041"/>
+            <w:tcW w:type="dxa" w:w="1814"/>
             <w:vAlign w:val="center"/>
           </w:tcPr>
           <w:p>
@@ -679,7 +939,7 @@
         </w:tc>
         <w:tc>
           <w:tcPr>
-            <w:tcW w:type="dxa" w:w="4762"/>
+            <w:tcW w:type="dxa" w:w="4195"/>
             <w:vAlign w:val="center"/>
           </w:tcPr>
           <w:p>
@@ -700,7 +960,7 @@
         </w:tc>
         <w:tc>
           <w:tcPr>
-            <w:tcW w:type="dxa" w:w="2268"/>
+            <w:tcW w:type="dxa" w:w="3061"/>
             <w:vAlign w:val="center"/>
           </w:tcPr>
           <w:p>
@@ -723,7 +983,7 @@
       <w:tr>
         <w:tc>
           <w:tcPr>
-            <w:tcW w:type="dxa" w:w="2041"/>
+            <w:tcW w:type="dxa" w:w="1814"/>
             <w:vAlign w:val="center"/>
           </w:tcPr>
           <w:p>
@@ -744,7 +1004,7 @@
         </w:tc>
         <w:tc>
           <w:tcPr>
-            <w:tcW w:type="dxa" w:w="4762"/>
+            <w:tcW w:type="dxa" w:w="4195"/>
             <w:vAlign w:val="center"/>
           </w:tcPr>
           <w:p>
@@ -765,7 +1025,7 @@
         </w:tc>
         <w:tc>
           <w:tcPr>
-            <w:tcW w:type="dxa" w:w="2268"/>
+            <w:tcW w:type="dxa" w:w="3061"/>
             <w:vAlign w:val="center"/>
           </w:tcPr>
           <w:p>
@@ -898,9 +1158,9 @@
         <w:tblLook w:firstColumn="1" w:firstRow="1" w:lastColumn="0" w:lastRow="0" w:noHBand="0" w:noVBand="1" w:val="04A0"/>
       </w:tblPr>
       <w:tblGrid>
-        <w:gridCol w:w="3324"/>
-        <w:gridCol w:w="3324"/>
-        <w:gridCol w:w="3324"/>
+        <w:gridCol w:w="3362"/>
+        <w:gridCol w:w="3362"/>
+        <w:gridCol w:w="3362"/>
       </w:tblGrid>
       <w:tr>
         <w:tc>
@@ -1547,7 +1807,7 @@
           <w:b w:val="0"/>
           <w:sz w:val="21"/>
         </w:rPr>
-        <w:t>서울우유 지정 수의사 (2010~현재) — 질병예방·위생·검정 기반 생산성 자문</w:t>
+        <w:t>서울우유 지정 수의사 (2010~현재) · 농림부·지자체 축산정책 컨설팅 다수</w:t>
       </w:r>
     </w:p>
     <w:p>
@@ -1561,7 +1821,7 @@
           <w:b w:val="0"/>
           <w:sz w:val="21"/>
         </w:rPr>
-        <w:t>경기도 디지털 축산 시범사업(Eco-BIT) 총괄기획·실증 · 농림부·지자체 축산정책 컨설팅 다수</w:t>
+        <w:t>경기도 디지털 축산 시범사업(Eco-BIT) 총괄기획·실증</w:t>
       </w:r>
     </w:p>
     <w:p>
@@ -1589,8 +1849,8 @@
         <w:tblLook w:firstColumn="1" w:firstRow="1" w:lastColumn="0" w:lastRow="0" w:noHBand="0" w:noVBand="1" w:val="04A0"/>
       </w:tblPr>
       <w:tblGrid>
-        <w:gridCol w:w="4986"/>
-        <w:gridCol w:w="4986"/>
+        <w:gridCol w:w="5043"/>
+        <w:gridCol w:w="5043"/>
       </w:tblGrid>
       <w:tr>
         <w:tc>
@@ -1657,7 +1917,7 @@
                 <w:color w:val="1B5E3A"/>
                 <w:sz w:val="19"/>
               </w:rPr>
-              <w:t>✔  저탄소축산물(저탄소 축산) 농장 인증</w:t>
+              <w:t>✔  저탄소축산물 농장 인증</w:t>
             </w:r>
           </w:p>
         </w:tc>
@@ -1733,7 +1993,7 @@
     </w:tbl>
     <w:p>
       <w:pPr>
-        <w:spacing w:before="200"/>
+        <w:spacing w:before="160"/>
       </w:pPr>
       <w:r>
         <w:rPr>
@@ -1742,12 +2002,12 @@
           <w:color w:val="555555"/>
           <w:sz w:val="16"/>
         </w:rPr>
-        <w:t>※ 본 이력서는 경기도지사직 인수위원회 축산·동물방역 분야 인수전문위원 추천용으로 작성되었습니다. 수상 연도·특허 상세는 원본 확인 후 보완 예정입니다. (출처: 본인 보유 공식 이력·인증서)</w:t>
+        <w:t>※ 경기도지사직 인수위원회 축산·동물방역 분야 인수전문위원 추천용. (근거: 본인 보유 표창장·인증서 원본)</w:t>
       </w:r>
     </w:p>
     <w:sectPr>
       <w:pgSz w:w="12240" w:h="15840"/>
-      <w:pgMar w:top="850" w:right="1134" w:bottom="850" w:left="1134" w:header="720" w:footer="720" w:gutter="0"/>
+      <w:pgMar w:top="794" w:right="1077" w:bottom="794" w:left="1077" w:header="720" w:footer="720" w:gutter="0"/>
       <w:cols w:space="720"/>
       <w:docGrid w:linePitch="360"/>
     </w:sectPr>

</xml_diff>

<commit_message>
Finalize committee resumes + verify facts via web (press) & certificates
- 한자 확정 河賢濟(명신고 졸업장), 건국대 졸업 1999.02.22, 겸임교수 2013~
- 표창 5건 확정(국무총리2021·장관2016·도지사 이재명2020/김동연2025·도의회2025)
- 추가: 드론 교육원(국토부 2017), 김장하 장학생 2년, 저지전용목장 2호
- 언론 검증 사실 저장: 국내 최초 동물복지 젖소농장(검역본부), 로봇착유 ICT, Corbett 교수 세미나, 저지전용 359원 지원

https://claude.ai/code/session_01Y6TtAZhVDLaxNYjVmtcmpZ
</commit_message>
<xml_diff>
--- a/deliverables/하현제_이력서_축산인수전문위원_추천용.docx
+++ b/deliverables/하현제_이력서_축산인수전문위원_추천용.docx
@@ -22,7 +22,7 @@
           <w:rFonts w:ascii="Malgun Gothic" w:hAnsi="Malgun Gothic" w:eastAsia="Malgun Gothic"/>
           <w:b/>
           <w:color w:val="142A4A"/>
-          <w:sz w:val="44"/>
+          <w:sz w:val="42"/>
         </w:rPr>
         <w:t>이  력  서  (전문위원 프로필)</w:t>
       </w:r>
@@ -35,7 +35,7 @@
           <w:color w:val="142A4A"/>
           <w:sz w:val="26"/>
         </w:rPr>
-        <w:t>하 현 제  (河 賢 齊 · Ha, Hyun-jae), D.V.M.</w:t>
+        <w:t>하 현 제  (河 賢 濟 · Ha, Hyun-jae), D.V.M.</w:t>
       </w:r>
     </w:p>
     <w:p>
@@ -60,7 +60,7 @@
           <w:color w:val="555555"/>
           <w:sz w:val="18"/>
         </w:rPr>
-        <w:t>생년월일 1973.10.25 | 수의사 면허 제10193호 | 010-6205-3150 | hhj3150@hanmail.net | 경기 안성시 미양면 역전길 14-42</w:t>
+        <w:t>생년월일 1973.10.25 | 수의사 면허 제10193호 | 010-6205-3150 | hhj3150@hanmail.net | 경기 안성</w:t>
       </w:r>
     </w:p>
     <w:p>
@@ -82,7 +82,7 @@
     </w:p>
     <w:p>
       <w:pPr>
-        <w:spacing w:before="180" w:after="60"/>
+        <w:spacing w:before="160" w:after="60"/>
         <w:pBdr>
           <w:bottom w:val="single" w:sz="8" w:space="1" w:color="1B5E3A"/>
         </w:pBdr>
@@ -107,12 +107,12 @@
           <w:b w:val="0"/>
           <w:sz w:val="21"/>
         </w:rPr>
-        <w:t>경기도는 전국 젖소 사육두수의 40% 이상을 보유한 대한민국 최대 낙농 기반입니다. 본 후보자는 경기 안성에서 동물복지·저탄소·경축순환 목장을 직접 운영하는 수의사로, 국무총리 표창·농림축산식품부 장관 표창·경기도지사 표창·경기도의회 의장 표창을 수상하고, 국내 1호 동물복지·저탄소 인증, 대한민국 최초 젖소 성감별 수정란 수출 등 현장에서 검증된 성과를 보유한 축산 전 분야 통합 전문가입니다. 가축질병·번식, 축산환경·악취, 탄소중립, ICT·AI 정밀축산, 6차산업까지 정책 설계에 필요한 현장성과 전문성을 두루 갖추어 인수전문위원으로 적임입니다.</w:t>
+        <w:t>경기도는 전국 젖소 사육두수의 40% 이상을 보유한 대한민국 최대 낙농 기반입니다. 본 후보자는 경기 안성에서 동물복지·저탄소·경축순환 목장을 직접 운영하는 수의사로, 국무총리·농림축산식품부 장관·경기도지사(2회)·경기도의회 의장 표창을 수상하고, 국내 1호 동물복지·저탄소 인증, 대한민국 최초 젖소 성감별 수정란 수출 등 현장에서 검증된 성과를 보유한 축산 전 분야 통합 전문가입니다. 가축질병·번식, 축산환경·악취, 탄소중립, ICT·AI·드론 정밀축산, 6차산업까지 정책 설계에 필요한 현장성과 전문성을 두루 갖추어 인수전문위원으로 적임입니다.</w:t>
       </w:r>
     </w:p>
     <w:p>
       <w:pPr>
-        <w:spacing w:before="180" w:after="60"/>
+        <w:spacing w:before="160" w:after="60"/>
         <w:pBdr>
           <w:bottom w:val="single" w:sz="8" w:space="1" w:color="1B5E3A"/>
         </w:pBdr>
@@ -135,15 +135,15 @@
         <w:tblLook w:firstColumn="1" w:firstRow="1" w:lastColumn="0" w:lastRow="0" w:noHBand="0" w:noVBand="1" w:val="04A0"/>
       </w:tblPr>
       <w:tblGrid>
-        <w:gridCol w:w="2521"/>
-        <w:gridCol w:w="2521"/>
-        <w:gridCol w:w="2521"/>
-        <w:gridCol w:w="2521"/>
+        <w:gridCol w:w="2550"/>
+        <w:gridCol w:w="2550"/>
+        <w:gridCol w:w="2550"/>
+        <w:gridCol w:w="2550"/>
       </w:tblGrid>
       <w:tr>
         <w:tc>
           <w:tcPr>
-            <w:tcW w:type="dxa" w:w="3402"/>
+            <w:tcW w:type="dxa" w:w="3175"/>
             <w:vAlign w:val="center"/>
             <w:shd w:val="clear" w:fill="DCE6DC"/>
           </w:tcPr>
@@ -209,7 +209,7 @@
         </w:tc>
         <w:tc>
           <w:tcPr>
-            <w:tcW w:type="dxa" w:w="2608"/>
+            <w:tcW w:type="dxa" w:w="2835"/>
             <w:vAlign w:val="center"/>
             <w:shd w:val="clear" w:fill="DCE6DC"/>
           </w:tcPr>
@@ -233,7 +233,7 @@
       <w:tr>
         <w:tc>
           <w:tcPr>
-            <w:tcW w:type="dxa" w:w="3402"/>
+            <w:tcW w:type="dxa" w:w="3175"/>
             <w:vAlign w:val="center"/>
           </w:tcPr>
           <w:p>
@@ -290,13 +290,13 @@
                 <w:b w:val="0"/>
                 <w:sz w:val="18"/>
               </w:rPr>
-              <w:t>2021.12.11</w:t>
+              <w:t>2021.11.11</w:t>
             </w:r>
           </w:p>
         </w:tc>
         <w:tc>
           <w:tcPr>
-            <w:tcW w:type="dxa" w:w="2608"/>
+            <w:tcW w:type="dxa" w:w="2835"/>
             <w:vAlign w:val="center"/>
           </w:tcPr>
           <w:p>
@@ -319,7 +319,7 @@
       <w:tr>
         <w:tc>
           <w:tcPr>
-            <w:tcW w:type="dxa" w:w="3402"/>
+            <w:tcW w:type="dxa" w:w="3175"/>
             <w:vAlign w:val="center"/>
           </w:tcPr>
           <w:p>
@@ -382,7 +382,7 @@
         </w:tc>
         <w:tc>
           <w:tcPr>
-            <w:tcW w:type="dxa" w:w="2608"/>
+            <w:tcW w:type="dxa" w:w="2835"/>
             <w:vAlign w:val="center"/>
           </w:tcPr>
           <w:p>
@@ -405,7 +405,93 @@
       <w:tr>
         <w:tc>
           <w:tcPr>
-            <w:tcW w:type="dxa" w:w="3402"/>
+            <w:tcW w:type="dxa" w:w="3175"/>
+            <w:vAlign w:val="center"/>
+          </w:tcPr>
+          <w:p>
+            <w:pPr>
+              <w:spacing w:after="20" w:before="20"/>
+              <w:jc w:val="left"/>
+            </w:pPr>
+            <w:r/>
+            <w:r>
+              <w:rPr>
+                <w:rFonts w:ascii="Malgun Gothic" w:hAnsi="Malgun Gothic" w:eastAsia="Malgun Gothic"/>
+                <w:b/>
+                <w:sz w:val="18"/>
+              </w:rPr>
+              <w:t>경기도지사 표창</w:t>
+            </w:r>
+          </w:p>
+        </w:tc>
+        <w:tc>
+          <w:tcPr>
+            <w:tcW w:type="dxa" w:w="1701"/>
+            <w:vAlign w:val="center"/>
+          </w:tcPr>
+          <w:p>
+            <w:pPr>
+              <w:spacing w:after="20" w:before="20"/>
+              <w:jc w:val="center"/>
+            </w:pPr>
+            <w:r/>
+            <w:r>
+              <w:rPr>
+                <w:rFonts w:ascii="Malgun Gothic" w:hAnsi="Malgun Gothic" w:eastAsia="Malgun Gothic"/>
+                <w:b w:val="0"/>
+                <w:sz w:val="18"/>
+              </w:rPr>
+              <w:t>제8230호</w:t>
+            </w:r>
+          </w:p>
+        </w:tc>
+        <w:tc>
+          <w:tcPr>
+            <w:tcW w:type="dxa" w:w="1474"/>
+            <w:vAlign w:val="center"/>
+          </w:tcPr>
+          <w:p>
+            <w:pPr>
+              <w:spacing w:after="20" w:before="20"/>
+              <w:jc w:val="center"/>
+            </w:pPr>
+            <w:r/>
+            <w:r>
+              <w:rPr>
+                <w:rFonts w:ascii="Malgun Gothic" w:hAnsi="Malgun Gothic" w:eastAsia="Malgun Gothic"/>
+                <w:b w:val="0"/>
+                <w:sz w:val="18"/>
+              </w:rPr>
+              <w:t>2020.12.22</w:t>
+            </w:r>
+          </w:p>
+        </w:tc>
+        <w:tc>
+          <w:tcPr>
+            <w:tcW w:type="dxa" w:w="2835"/>
+            <w:vAlign w:val="center"/>
+          </w:tcPr>
+          <w:p>
+            <w:pPr>
+              <w:spacing w:after="20" w:before="20"/>
+              <w:jc w:val="center"/>
+            </w:pPr>
+            <w:r/>
+            <w:r>
+              <w:rPr>
+                <w:rFonts w:ascii="Malgun Gothic" w:hAnsi="Malgun Gothic" w:eastAsia="Malgun Gothic"/>
+                <w:b w:val="0"/>
+                <w:sz w:val="18"/>
+              </w:rPr>
+              <w:t>경기도지사 이재명</w:t>
+            </w:r>
+          </w:p>
+        </w:tc>
+      </w:tr>
+      <w:tr>
+        <w:tc>
+          <w:tcPr>
+            <w:tcW w:type="dxa" w:w="3175"/>
             <w:vAlign w:val="center"/>
           </w:tcPr>
           <w:p>
@@ -468,7 +554,7 @@
         </w:tc>
         <w:tc>
           <w:tcPr>
-            <w:tcW w:type="dxa" w:w="2608"/>
+            <w:tcW w:type="dxa" w:w="2835"/>
             <w:vAlign w:val="center"/>
           </w:tcPr>
           <w:p>
@@ -491,7 +577,7 @@
       <w:tr>
         <w:tc>
           <w:tcPr>
-            <w:tcW w:type="dxa" w:w="3402"/>
+            <w:tcW w:type="dxa" w:w="3175"/>
             <w:vAlign w:val="center"/>
           </w:tcPr>
           <w:p>
@@ -554,7 +640,7 @@
         </w:tc>
         <w:tc>
           <w:tcPr>
-            <w:tcW w:type="dxa" w:w="2608"/>
+            <w:tcW w:type="dxa" w:w="2835"/>
             <w:vAlign w:val="center"/>
           </w:tcPr>
           <w:p>
@@ -585,7 +671,7 @@
           <w:rFonts w:ascii="Malgun Gothic" w:hAnsi="Malgun Gothic" w:eastAsia="Malgun Gothic"/>
           <w:b/>
           <w:color w:val="1B5E3A"/>
-          <w:sz w:val="19"/>
+          <w:sz w:val="18"/>
         </w:rPr>
         <w:t xml:space="preserve">▸ 목장 수상  </w:t>
       </w:r>
@@ -593,7 +679,7 @@
         <w:rPr>
           <w:rFonts w:ascii="Malgun Gothic" w:hAnsi="Malgun Gothic" w:eastAsia="Malgun Gothic"/>
           <w:b w:val="0"/>
-          <w:sz w:val="19"/>
+          <w:sz w:val="18"/>
         </w:rPr>
         <w:t>2021 친환경축산대상 인증농가부문 최우수상 (제2021-02호, 2021.12.07, 농식품부 주최·(사)친환경축산협회) — 송영신목장</w:t>
       </w:r>
@@ -608,7 +694,7 @@
           <w:rFonts w:ascii="Malgun Gothic" w:hAnsi="Malgun Gothic" w:eastAsia="Malgun Gothic"/>
           <w:b/>
           <w:color w:val="1B5E3A"/>
-          <w:sz w:val="19"/>
+          <w:sz w:val="18"/>
         </w:rPr>
         <w:t xml:space="preserve">▸ 국제 학술  </w:t>
       </w:r>
@@ -616,14 +702,14 @@
         <w:rPr>
           <w:rFonts w:ascii="Malgun Gothic" w:hAnsi="Malgun Gothic" w:eastAsia="Malgun Gothic"/>
           <w:b w:val="0"/>
-          <w:sz w:val="19"/>
+          <w:sz w:val="18"/>
         </w:rPr>
         <w:t>연변대학교 농학원 제3회 해란강포럼 국제심포지엄 특별초청 발표 (2025.7.4) — “지속가능 농업의 축산: 생태적 회복력의 경로와 실천”</w:t>
       </w:r>
     </w:p>
     <w:p>
       <w:pPr>
-        <w:spacing w:before="180" w:after="60"/>
+        <w:spacing w:before="160" w:after="60"/>
         <w:pBdr>
           <w:bottom w:val="single" w:sz="8" w:space="1" w:color="1B5E3A"/>
         </w:pBdr>
@@ -755,7 +841,7 @@
     </w:p>
     <w:p>
       <w:pPr>
-        <w:spacing w:before="180" w:after="60"/>
+        <w:spacing w:before="160" w:after="60"/>
         <w:pBdr>
           <w:bottom w:val="single" w:sz="8" w:space="1" w:color="1B5E3A"/>
         </w:pBdr>
@@ -778,9 +864,9 @@
         <w:tblLook w:firstColumn="1" w:firstRow="1" w:lastColumn="0" w:lastRow="0" w:noHBand="0" w:noVBand="1" w:val="04A0"/>
       </w:tblPr>
       <w:tblGrid>
-        <w:gridCol w:w="3362"/>
-        <w:gridCol w:w="3362"/>
-        <w:gridCol w:w="3362"/>
+        <w:gridCol w:w="3400"/>
+        <w:gridCol w:w="3400"/>
+        <w:gridCol w:w="3400"/>
       </w:tblGrid>
       <w:tr>
         <w:tc>
@@ -910,7 +996,7 @@
                 <w:b w:val="0"/>
                 <w:sz w:val="19"/>
               </w:rPr>
-              <w:t>졸업 / 김장하(남성학숙) 장학생</w:t>
+              <w:t>졸업 / 김장하(남성학숙) 장학생 2년 연속</w:t>
             </w:r>
           </w:p>
         </w:tc>
@@ -933,7 +1019,7 @@
                 <w:b w:val="0"/>
                 <w:sz w:val="19"/>
               </w:rPr>
-              <w:t>1992 ~ 1998</w:t>
+              <w:t>1992 ~ 1999</w:t>
             </w:r>
           </w:p>
         </w:tc>
@@ -1048,7 +1134,7 @@
     </w:tbl>
     <w:p>
       <w:pPr>
-        <w:spacing w:before="180" w:after="60"/>
+        <w:spacing w:before="160" w:after="60"/>
         <w:pBdr>
           <w:bottom w:val="single" w:sz="8" w:space="1" w:color="1B5E3A"/>
         </w:pBdr>
@@ -1088,7 +1174,7 @@
           <w:b w:val="0"/>
           <w:sz w:val="21"/>
         </w:rPr>
-        <w:t>건국대학교 수의과대학 겸임교수 (2011~현재) · 국립한경대학교 축산전문강사</w:t>
+        <w:t>건국대학교 수의과대학 겸임교수 (2013~현재) · 국립한경대학교 축산전문강사</w:t>
       </w:r>
     </w:p>
     <w:p>
@@ -1116,7 +1202,7 @@
           <w:b w:val="0"/>
           <w:sz w:val="21"/>
         </w:rPr>
-        <w:t>KOICA · KOPIA 국제농업협력 전문가(전문요원) · 국가연구자번호 11152141</w:t>
+        <w:t>㈜날틀 무인항공기 교육원 — 초경량비행장치(드론) 조종자 전문교육기관 (국토교통부 지정, 2017)</w:t>
       </w:r>
     </w:p>
     <w:p>
@@ -1130,12 +1216,12 @@
           <w:b w:val="0"/>
           <w:sz w:val="21"/>
         </w:rPr>
-        <w:t>특허 2건 보유 (축산환경·정밀축산 분야) — 명칭·번호 별첨</w:t>
+        <w:t>KOICA · KOPIA 국제농업협력 전문요원 · 국가연구자번호 11152141 · 특허 2건 보유</w:t>
       </w:r>
     </w:p>
     <w:p>
       <w:pPr>
-        <w:spacing w:before="180" w:after="60"/>
+        <w:spacing w:before="160" w:after="60"/>
         <w:pBdr>
           <w:bottom w:val="single" w:sz="8" w:space="1" w:color="1B5E3A"/>
         </w:pBdr>
@@ -1158,14 +1244,14 @@
         <w:tblLook w:firstColumn="1" w:firstRow="1" w:lastColumn="0" w:lastRow="0" w:noHBand="0" w:noVBand="1" w:val="04A0"/>
       </w:tblPr>
       <w:tblGrid>
-        <w:gridCol w:w="3362"/>
-        <w:gridCol w:w="3362"/>
-        <w:gridCol w:w="3362"/>
+        <w:gridCol w:w="3400"/>
+        <w:gridCol w:w="3400"/>
+        <w:gridCol w:w="3400"/>
       </w:tblGrid>
       <w:tr>
         <w:tc>
           <w:tcPr>
-            <w:tcW w:type="dxa" w:w="2041"/>
+            <w:tcW w:type="dxa" w:w="1928"/>
             <w:vAlign w:val="center"/>
             <w:shd w:val="clear" w:fill="EAEFEA"/>
           </w:tcPr>
@@ -1209,7 +1295,7 @@
         </w:tc>
         <w:tc>
           <w:tcPr>
-            <w:tcW w:type="dxa" w:w="2721"/>
+            <w:tcW w:type="dxa" w:w="2835"/>
             <w:vAlign w:val="center"/>
             <w:shd w:val="clear" w:fill="EAEFEA"/>
           </w:tcPr>
@@ -1233,7 +1319,7 @@
       <w:tr>
         <w:tc>
           <w:tcPr>
-            <w:tcW w:type="dxa" w:w="2041"/>
+            <w:tcW w:type="dxa" w:w="1928"/>
             <w:vAlign w:val="center"/>
           </w:tcPr>
           <w:p>
@@ -1275,7 +1361,7 @@
         </w:tc>
         <w:tc>
           <w:tcPr>
-            <w:tcW w:type="dxa" w:w="2721"/>
+            <w:tcW w:type="dxa" w:w="2835"/>
             <w:vAlign w:val="center"/>
           </w:tcPr>
           <w:p>
@@ -1298,7 +1384,7 @@
       <w:tr>
         <w:tc>
           <w:tcPr>
-            <w:tcW w:type="dxa" w:w="2041"/>
+            <w:tcW w:type="dxa" w:w="1928"/>
             <w:vAlign w:val="center"/>
           </w:tcPr>
           <w:p>
@@ -1340,7 +1426,7 @@
         </w:tc>
         <w:tc>
           <w:tcPr>
-            <w:tcW w:type="dxa" w:w="2721"/>
+            <w:tcW w:type="dxa" w:w="2835"/>
             <w:vAlign w:val="center"/>
           </w:tcPr>
           <w:p>
@@ -1363,7 +1449,7 @@
       <w:tr>
         <w:tc>
           <w:tcPr>
-            <w:tcW w:type="dxa" w:w="2041"/>
+            <w:tcW w:type="dxa" w:w="1928"/>
             <w:vAlign w:val="center"/>
           </w:tcPr>
           <w:p>
@@ -1405,7 +1491,7 @@
         </w:tc>
         <w:tc>
           <w:tcPr>
-            <w:tcW w:type="dxa" w:w="2721"/>
+            <w:tcW w:type="dxa" w:w="2835"/>
             <w:vAlign w:val="center"/>
           </w:tcPr>
           <w:p>
@@ -1428,7 +1514,7 @@
       <w:tr>
         <w:tc>
           <w:tcPr>
-            <w:tcW w:type="dxa" w:w="2041"/>
+            <w:tcW w:type="dxa" w:w="1928"/>
             <w:vAlign w:val="center"/>
           </w:tcPr>
           <w:p>
@@ -1470,7 +1556,7 @@
         </w:tc>
         <w:tc>
           <w:tcPr>
-            <w:tcW w:type="dxa" w:w="2721"/>
+            <w:tcW w:type="dxa" w:w="2835"/>
             <w:vAlign w:val="center"/>
           </w:tcPr>
           <w:p>
@@ -1493,7 +1579,7 @@
       <w:tr>
         <w:tc>
           <w:tcPr>
-            <w:tcW w:type="dxa" w:w="2041"/>
+            <w:tcW w:type="dxa" w:w="1928"/>
             <w:vAlign w:val="center"/>
           </w:tcPr>
           <w:p>
@@ -1535,7 +1621,7 @@
         </w:tc>
         <w:tc>
           <w:tcPr>
-            <w:tcW w:type="dxa" w:w="2721"/>
+            <w:tcW w:type="dxa" w:w="2835"/>
             <w:vAlign w:val="center"/>
           </w:tcPr>
           <w:p>
@@ -1558,7 +1644,7 @@
       <w:tr>
         <w:tc>
           <w:tcPr>
-            <w:tcW w:type="dxa" w:w="2041"/>
+            <w:tcW w:type="dxa" w:w="1928"/>
             <w:vAlign w:val="center"/>
           </w:tcPr>
           <w:p>
@@ -1600,7 +1686,7 @@
         </w:tc>
         <w:tc>
           <w:tcPr>
-            <w:tcW w:type="dxa" w:w="2721"/>
+            <w:tcW w:type="dxa" w:w="2835"/>
             <w:vAlign w:val="center"/>
           </w:tcPr>
           <w:p>
@@ -1623,7 +1709,7 @@
       <w:tr>
         <w:tc>
           <w:tcPr>
-            <w:tcW w:type="dxa" w:w="2041"/>
+            <w:tcW w:type="dxa" w:w="1928"/>
             <w:vAlign w:val="center"/>
           </w:tcPr>
           <w:p>
@@ -1665,7 +1751,7 @@
         </w:tc>
         <w:tc>
           <w:tcPr>
-            <w:tcW w:type="dxa" w:w="2721"/>
+            <w:tcW w:type="dxa" w:w="2835"/>
             <w:vAlign w:val="center"/>
           </w:tcPr>
           <w:p>
@@ -1688,7 +1774,72 @@
       <w:tr>
         <w:tc>
           <w:tcPr>
-            <w:tcW w:type="dxa" w:w="2041"/>
+            <w:tcW w:type="dxa" w:w="1928"/>
+            <w:vAlign w:val="center"/>
+          </w:tcPr>
+          <w:p>
+            <w:pPr>
+              <w:spacing w:after="20" w:before="20"/>
+              <w:jc w:val="center"/>
+            </w:pPr>
+            <w:r/>
+            <w:r>
+              <w:rPr>
+                <w:rFonts w:ascii="Malgun Gothic" w:hAnsi="Malgun Gothic" w:eastAsia="Malgun Gothic"/>
+                <w:b w:val="0"/>
+                <w:sz w:val="18"/>
+              </w:rPr>
+              <w:t>2017 ~ 현재</w:t>
+            </w:r>
+          </w:p>
+        </w:tc>
+        <w:tc>
+          <w:tcPr>
+            <w:tcW w:type="dxa" w:w="4309"/>
+            <w:vAlign w:val="center"/>
+          </w:tcPr>
+          <w:p>
+            <w:pPr>
+              <w:spacing w:after="20" w:before="20"/>
+              <w:jc w:val="left"/>
+            </w:pPr>
+            <w:r/>
+            <w:r>
+              <w:rPr>
+                <w:rFonts w:ascii="Malgun Gothic" w:hAnsi="Malgun Gothic" w:eastAsia="Malgun Gothic"/>
+                <w:b w:val="0"/>
+                <w:sz w:val="18"/>
+              </w:rPr>
+              <w:t>㈜날틀 무인항공기 교육원 / 설치·운영</w:t>
+            </w:r>
+          </w:p>
+        </w:tc>
+        <w:tc>
+          <w:tcPr>
+            <w:tcW w:type="dxa" w:w="2835"/>
+            <w:vAlign w:val="center"/>
+          </w:tcPr>
+          <w:p>
+            <w:pPr>
+              <w:spacing w:after="20" w:before="20"/>
+              <w:jc w:val="left"/>
+            </w:pPr>
+            <w:r/>
+            <w:r>
+              <w:rPr>
+                <w:rFonts w:ascii="Malgun Gothic" w:hAnsi="Malgun Gothic" w:eastAsia="Malgun Gothic"/>
+                <w:b w:val="0"/>
+                <w:sz w:val="18"/>
+              </w:rPr>
+              <w:t>드론 조종자 전문교육(국토부 지정)</w:t>
+            </w:r>
+          </w:p>
+        </w:tc>
+      </w:tr>
+      <w:tr>
+        <w:tc>
+          <w:tcPr>
+            <w:tcW w:type="dxa" w:w="1928"/>
             <w:vAlign w:val="center"/>
           </w:tcPr>
           <w:p>
@@ -1730,7 +1881,7 @@
         </w:tc>
         <w:tc>
           <w:tcPr>
-            <w:tcW w:type="dxa" w:w="2721"/>
+            <w:tcW w:type="dxa" w:w="2835"/>
             <w:vAlign w:val="center"/>
           </w:tcPr>
           <w:p>
@@ -1753,7 +1904,7 @@
     </w:tbl>
     <w:p>
       <w:pPr>
-        <w:spacing w:before="180" w:after="60"/>
+        <w:spacing w:before="160" w:after="60"/>
         <w:pBdr>
           <w:bottom w:val="single" w:sz="8" w:space="1" w:color="1B5E3A"/>
         </w:pBdr>
@@ -1779,7 +1930,7 @@
           <w:b w:val="0"/>
           <w:sz w:val="21"/>
         </w:rPr>
-        <w:t>농림축산식품부 낙농 우사 표준설계 자문위원 (2016)</w:t>
+        <w:t>농림축산식품부 낙농 우사 표준설계 자문위원 (2016) · 지정 ICT 모델목장 (2016)</w:t>
       </w:r>
     </w:p>
     <w:p>
@@ -1793,7 +1944,7 @@
           <w:b w:val="0"/>
           <w:sz w:val="21"/>
         </w:rPr>
-        <w:t>농림축산식품부 지정 ICT 모델목장 (2016) · 경기 한우/낙농 마이스터 강사 (2016)</w:t>
+        <w:t>경기 한우/낙농 마이스터 강사 (2016) · 서울우유 지정 수의사 (2010~현재)</w:t>
       </w:r>
     </w:p>
     <w:p>
@@ -1807,26 +1958,12 @@
           <w:b w:val="0"/>
           <w:sz w:val="21"/>
         </w:rPr>
-        <w:t>서울우유 지정 수의사 (2010~현재) · 농림부·지자체 축산정책 컨설팅 다수</w:t>
+        <w:t>경기도 디지털 축산 시범사업(Eco-BIT) 총괄기획·실증 · 농림부·지자체 축산정책 컨설팅 다수</w:t>
       </w:r>
     </w:p>
     <w:p>
       <w:pPr>
-        <w:pStyle w:val="ListBullet"/>
-        <w:spacing w:after="40"/>
-      </w:pPr>
-      <w:r>
-        <w:rPr>
-          <w:rFonts w:ascii="Malgun Gothic" w:hAnsi="Malgun Gothic" w:eastAsia="Malgun Gothic"/>
-          <w:b w:val="0"/>
-          <w:sz w:val="21"/>
-        </w:rPr>
-        <w:t>경기도 디지털 축산 시범사업(Eco-BIT) 총괄기획·실증</w:t>
-      </w:r>
-    </w:p>
-    <w:p>
-      <w:pPr>
-        <w:spacing w:before="180" w:after="60"/>
+        <w:spacing w:before="160" w:after="60"/>
         <w:pBdr>
           <w:bottom w:val="single" w:sz="8" w:space="1" w:color="1B5E3A"/>
         </w:pBdr>
@@ -1849,8 +1986,8 @@
         <w:tblLook w:firstColumn="1" w:firstRow="1" w:lastColumn="0" w:lastRow="0" w:noHBand="0" w:noVBand="1" w:val="04A0"/>
       </w:tblPr>
       <w:tblGrid>
-        <w:gridCol w:w="5043"/>
-        <w:gridCol w:w="5043"/>
+        <w:gridCol w:w="5100"/>
+        <w:gridCol w:w="5100"/>
       </w:tblGrid>
       <w:tr>
         <w:tc>
@@ -1869,9 +2006,9 @@
                 <w:rFonts w:ascii="Malgun Gothic" w:hAnsi="Malgun Gothic" w:eastAsia="Malgun Gothic"/>
                 <w:b w:val="0"/>
                 <w:color w:val="1B5E3A"/>
-                <w:sz w:val="19"/>
+                <w:sz w:val="18"/>
               </w:rPr>
-              <w:t>✔  동물복지축산농장 인증 (2016.09.20~2028.04.27)</w:t>
+              <w:t>✔  동물복지축산농장 인증 (2016.09.20)</w:t>
             </w:r>
           </w:p>
         </w:tc>
@@ -1891,7 +2028,7 @@
                 <w:rFonts w:ascii="Malgun Gothic" w:hAnsi="Malgun Gothic" w:eastAsia="Malgun Gothic"/>
                 <w:b w:val="0"/>
                 <w:color w:val="1B5E3A"/>
-                <w:sz w:val="19"/>
+                <w:sz w:val="18"/>
               </w:rPr>
               <w:t>✔  유기축산물 · 유기건초 인증</w:t>
             </w:r>
@@ -1915,9 +2052,9 @@
                 <w:rFonts w:ascii="Malgun Gothic" w:hAnsi="Malgun Gothic" w:eastAsia="Malgun Gothic"/>
                 <w:b w:val="0"/>
                 <w:color w:val="1B5E3A"/>
-                <w:sz w:val="19"/>
+                <w:sz w:val="18"/>
               </w:rPr>
-              <w:t>✔  저탄소축산물 농장 인증</w:t>
+              <w:t>✔  저탄소축산물 농장 인증 (2024.10~2027.10)</w:t>
             </w:r>
           </w:p>
         </w:tc>
@@ -1937,7 +2074,7 @@
                 <w:rFonts w:ascii="Malgun Gothic" w:hAnsi="Malgun Gothic" w:eastAsia="Malgun Gothic"/>
                 <w:b w:val="0"/>
                 <w:color w:val="1B5E3A"/>
-                <w:sz w:val="19"/>
+                <w:sz w:val="18"/>
               </w:rPr>
               <w:t>✔  깨끗한 목장 인증</w:t>
             </w:r>
@@ -1961,7 +2098,7 @@
                 <w:rFonts w:ascii="Malgun Gothic" w:hAnsi="Malgun Gothic" w:eastAsia="Malgun Gothic"/>
                 <w:b w:val="0"/>
                 <w:color w:val="1B5E3A"/>
-                <w:sz w:val="19"/>
+                <w:sz w:val="18"/>
               </w:rPr>
               <w:t>✔  (가축)행복농장 인증 (2019.11.08)</w:t>
             </w:r>
@@ -1983,7 +2120,7 @@
                 <w:rFonts w:ascii="Malgun Gothic" w:hAnsi="Malgun Gothic" w:eastAsia="Malgun Gothic"/>
                 <w:b w:val="0"/>
                 <w:color w:val="1B5E3A"/>
-                <w:sz w:val="19"/>
+                <w:sz w:val="18"/>
               </w:rPr>
               <w:t>✔  농협 동물복지·무첨가 인증</w:t>
             </w:r>
@@ -1993,7 +2130,7 @@
     </w:tbl>
     <w:p>
       <w:pPr>
-        <w:spacing w:before="160"/>
+        <w:spacing w:before="140"/>
       </w:pPr>
       <w:r>
         <w:rPr>
@@ -2007,7 +2144,7 @@
     </w:p>
     <w:sectPr>
       <w:pgSz w:w="12240" w:h="15840"/>
-      <w:pgMar w:top="794" w:right="1077" w:bottom="794" w:left="1077" w:header="720" w:footer="720" w:gutter="0"/>
+      <w:pgMar w:top="737" w:right="1020" w:bottom="737" w:left="1020" w:header="720" w:footer="720" w:gutter="0"/>
       <w:cols w:space="720"/>
       <w:docGrid w:linePitch="360"/>
     </w:sectPr>

</xml_diff>